<commit_message>
Add a Capstone folder: scenarios + datasets, Definition of Done, moved Brief
- New top-level Capstone/ with the Brief, a Definition of Done (concrete
  checklist + expanded rubric + a written "what a finished one looks like"),
  and Sample Scenarios (3 ready-to-use, workflow-shaped scenarios with datasets)
  so learners without their own data (or unsure about anonymizing) can still do it
- Plain-English anonymizing note + reassurance that a scenario counts fully
- Data/ holds each scenario's files (regional sales folder + lookup; messy
  support tickets; marketing spend folder + lookup)
- Moved Capstone Brief out of Session 3; updated its Participant Guide + README

Co-Authored-By: Claude Opus 4.8 <noreply@anthropic.com>
</commit_message>
<xml_diff>
--- a/Session 3 - Build & Ship a Reusable Workflow/Participant Guide.docx
+++ b/Session 3 - Build & Ship a Reusable Workflow/Participant Guide.docx
@@ -847,7 +847,7 @@
           <w:color w:val="101110"/>
           <w:sz w:val="22"/>
         </w:rPr>
-        <w:t xml:space="preserve"> recurring data. See the </w:t>
+        <w:t xml:space="preserve"> recurring data — or on one of the ready‑made scenarios if you'd rather not use your own. Everything is in the top‑level </w:t>
       </w:r>
       <w:r>
         <w:rPr>
@@ -856,7 +856,7 @@
           <w:color w:val="101110"/>
           <w:sz w:val="22"/>
         </w:rPr>
-        <w:t>Capstone Brief</w:t>
+        <w:t>Capstone</w:t>
       </w:r>
       <w:r>
         <w:rPr>
@@ -864,7 +864,41 @@
           <w:color w:val="101110"/>
           <w:sz w:val="22"/>
         </w:rPr>
-        <w:t xml:space="preserve"> in this folder for what to build and how it's assessed.</w:t>
+        <w:t xml:space="preserve"> folder: the Brief (what/when/how), </w:t>
+      </w:r>
+      <w:r>
+        <w:rPr>
+          <w:rFonts w:ascii="Calibri" w:hAnsi="Calibri"/>
+          <w:b/>
+          <w:color w:val="101110"/>
+          <w:sz w:val="22"/>
+        </w:rPr>
+        <w:t>Sample Scenarios</w:t>
+      </w:r>
+      <w:r>
+        <w:rPr>
+          <w:rFonts w:ascii="Calibri" w:hAnsi="Calibri"/>
+          <w:color w:val="101110"/>
+          <w:sz w:val="22"/>
+        </w:rPr>
+        <w:t xml:space="preserve"> with data, and a </w:t>
+      </w:r>
+      <w:r>
+        <w:rPr>
+          <w:rFonts w:ascii="Calibri" w:hAnsi="Calibri"/>
+          <w:b/>
+          <w:color w:val="101110"/>
+          <w:sz w:val="22"/>
+        </w:rPr>
+        <w:t>Definition of Done</w:t>
+      </w:r>
+      <w:r>
+        <w:rPr>
+          <w:rFonts w:ascii="Calibri" w:hAnsi="Calibri"/>
+          <w:color w:val="101110"/>
+          <w:sz w:val="22"/>
+        </w:rPr>
+        <w:t>.</w:t>
       </w:r>
     </w:p>
     <w:p>

</xml_diff>